<commit_message>
Bland svarmulighederne, så facit ikke altid står først
Det rigtige svar stod som A i alle 30 spørgsmål, fordi det var sådan de blev
skrevet ned. byg_quiz.py blander nu de fire muligheder med en fast seed, så alle
formater får præcis samme rækkefølge, og scriptet afviser en skæv fordeling.
Facit ligger nu 6 gange på A, 7 på B, 10 på C og 7 på D.

Alle udgaver er bygget om: den interaktive side, regnearket, PowerPointen,
Word- og tekstudgaven, de 30 billeder og overbliks-PDF'en. Regnearkets
facitkolonne er sammenlignet med kilden bagefter, og siden er afprøvet i browser
igen — koderne afkoder stadig præcis rigtigt.

Co-Authored-By: Claude Opus 5 <noreply@anthropic.com>
Claude-Session: https://claude.ai/code/session_01VgEVctXq3tNeZxt6iAFBPu
</commit_message>
<xml_diff>
--- a/facit/forms-statistik-2026-09-11.docx
+++ b/facit/forms-statistik-2026-09-11.docx
@@ -51,11 +51,7 @@
         <w:ind w:left="360"/>
       </w:pPr>
       <w:r>
-        <w:rPr>
-          <w:b/>
-          <w:color w:val="1A8F5E"/>
-        </w:rPr>
-        <w:t>*A. 6</w:t>
+        <w:t>A. 8</w:t>
       </w:r>
     </w:p>
     <w:p>
@@ -73,7 +69,11 @@
         <w:ind w:left="360"/>
       </w:pPr>
       <w:r>
-        <w:t>C. 5</w:t>
+        <w:rPr>
+          <w:b/>
+          <w:color w:val="1A8F5E"/>
+        </w:rPr>
+        <w:t>*C. 6</w:t>
       </w:r>
     </w:p>
     <w:p>
@@ -82,7 +82,7 @@
         <w:ind w:left="360"/>
       </w:pPr>
       <w:r>
-        <w:t>D. 8</w:t>
+        <w:t>D. 5</w:t>
       </w:r>
     </w:p>
     <w:p>
@@ -111,11 +111,7 @@
         <w:ind w:left="360"/>
       </w:pPr>
       <w:r>
-        <w:rPr>
-          <w:b/>
-          <w:color w:val="1A8F5E"/>
-        </w:rPr>
-        <w:t>*A. 5</w:t>
+        <w:t>A. 6</w:t>
       </w:r>
     </w:p>
     <w:p>
@@ -124,7 +120,7 @@
         <w:ind w:left="360"/>
       </w:pPr>
       <w:r>
-        <w:t>B. 6</w:t>
+        <w:t>B. 13</w:t>
       </w:r>
     </w:p>
     <w:p>
@@ -142,7 +138,11 @@
         <w:ind w:left="360"/>
       </w:pPr>
       <w:r>
-        <w:t>D. 13</w:t>
+        <w:rPr>
+          <w:b/>
+          <w:color w:val="1A8F5E"/>
+        </w:rPr>
+        <w:t>*D. 5</w:t>
       </w:r>
     </w:p>
     <w:p>
@@ -184,7 +184,7 @@
         <w:ind w:left="360"/>
       </w:pPr>
       <w:r>
-        <w:t>B. 13</w:t>
+        <w:t>B. 3</w:t>
       </w:r>
     </w:p>
     <w:p>
@@ -193,7 +193,7 @@
         <w:ind w:left="360"/>
       </w:pPr>
       <w:r>
-        <w:t>C. 3</w:t>
+        <w:t>C. 13</w:t>
       </w:r>
     </w:p>
     <w:p>
@@ -231,11 +231,7 @@
         <w:ind w:left="360"/>
       </w:pPr>
       <w:r>
-        <w:rPr>
-          <w:b/>
-          <w:color w:val="1A8F5E"/>
-        </w:rPr>
-        <w:t>*A. 7</w:t>
+        <w:t>A. 49</w:t>
       </w:r>
     </w:p>
     <w:p>
@@ -253,7 +249,11 @@
         <w:ind w:left="360"/>
       </w:pPr>
       <w:r>
-        <w:t>C. 5</w:t>
+        <w:rPr>
+          <w:b/>
+          <w:color w:val="1A8F5E"/>
+        </w:rPr>
+        <w:t>*C. 7</w:t>
       </w:r>
     </w:p>
     <w:p>
@@ -262,7 +262,7 @@
         <w:ind w:left="360"/>
       </w:pPr>
       <w:r>
-        <w:t>D. 49</w:t>
+        <w:t>D. 5</w:t>
       </w:r>
     </w:p>
     <w:p>
@@ -291,38 +291,38 @@
         <w:ind w:left="360"/>
       </w:pPr>
       <w:r>
+        <w:t>A. 9</w:t>
+      </w:r>
+    </w:p>
+    <w:p>
+      <w:pPr>
+        <w:spacing w:after="0"/>
+        <w:ind w:left="360"/>
+      </w:pPr>
+      <w:r>
+        <w:t>B. 6</w:t>
+      </w:r>
+    </w:p>
+    <w:p>
+      <w:pPr>
+        <w:spacing w:after="0"/>
+        <w:ind w:left="360"/>
+      </w:pPr>
+      <w:r>
+        <w:t>C. 3</w:t>
+      </w:r>
+    </w:p>
+    <w:p>
+      <w:pPr>
+        <w:spacing w:after="0"/>
+        <w:ind w:left="360"/>
+      </w:pPr>
+      <w:r>
         <w:rPr>
           <w:b/>
           <w:color w:val="1A8F5E"/>
         </w:rPr>
-        <w:t>*A. 5</w:t>
-      </w:r>
-    </w:p>
-    <w:p>
-      <w:pPr>
-        <w:spacing w:after="0"/>
-        <w:ind w:left="360"/>
-      </w:pPr>
-      <w:r>
-        <w:t>B. 3</w:t>
-      </w:r>
-    </w:p>
-    <w:p>
-      <w:pPr>
-        <w:spacing w:after="0"/>
-        <w:ind w:left="360"/>
-      </w:pPr>
-      <w:r>
-        <w:t>C. 6</w:t>
-      </w:r>
-    </w:p>
-    <w:p>
-      <w:pPr>
-        <w:spacing w:after="0"/>
-        <w:ind w:left="360"/>
-      </w:pPr>
-      <w:r>
-        <w:t>D. 9</w:t>
+        <w:t>*D. 5</w:t>
       </w:r>
     </w:p>
     <w:p>
@@ -351,11 +351,7 @@
         <w:ind w:left="360"/>
       </w:pPr>
       <w:r>
-        <w:rPr>
-          <w:b/>
-          <w:color w:val="1A8F5E"/>
-        </w:rPr>
-        <w:t>*A. 9</w:t>
+        <w:t>A. 8</w:t>
       </w:r>
     </w:p>
     <w:p>
@@ -382,7 +378,11 @@
         <w:ind w:left="360"/>
       </w:pPr>
       <w:r>
-        <w:t>D. 8</w:t>
+        <w:rPr>
+          <w:b/>
+          <w:color w:val="1A8F5E"/>
+        </w:rPr>
+        <w:t>*D. 9</w:t>
       </w:r>
     </w:p>
     <w:p>
@@ -411,11 +411,20 @@
         <w:ind w:left="360"/>
       </w:pPr>
       <w:r>
+        <w:t>A. Gennemsnit, median, typetal, sum og antal</w:t>
+      </w:r>
+    </w:p>
+    <w:p>
+      <w:pPr>
+        <w:spacing w:after="0"/>
+        <w:ind w:left="360"/>
+      </w:pPr>
+      <w:r>
         <w:rPr>
           <w:b/>
           <w:color w:val="1A8F5E"/>
         </w:rPr>
-        <w:t>*A. Mindste, nedre kvartil, median, øvre kvartil, største</w:t>
+        <w:t>*B. Mindste, nedre kvartil, median, øvre kvartil, største</w:t>
       </w:r>
     </w:p>
     <w:p>
@@ -424,7 +433,7 @@
         <w:ind w:left="360"/>
       </w:pPr>
       <w:r>
-        <w:t>B. Mindste, gennemsnit, median, typetal, største</w:t>
+        <w:t>C. Mindste, gennemsnit, median, typetal, største</w:t>
       </w:r>
     </w:p>
     <w:p>
@@ -433,16 +442,7 @@
         <w:ind w:left="360"/>
       </w:pPr>
       <w:r>
-        <w:t>C. De fem mindste tal i datasættet</w:t>
-      </w:r>
-    </w:p>
-    <w:p>
-      <w:pPr>
-        <w:spacing w:after="0"/>
-        <w:ind w:left="360"/>
-      </w:pPr>
-      <w:r>
-        <w:t>D. Gennemsnit, median, typetal, sum og antal</w:t>
+        <w:t>D. De fem mindste tal i datasættet</w:t>
       </w:r>
     </w:p>
     <w:p>
@@ -471,20 +471,20 @@
         <w:ind w:left="360"/>
       </w:pPr>
       <w:r>
+        <w:t>A. 25 %</w:t>
+      </w:r>
+    </w:p>
+    <w:p>
+      <w:pPr>
+        <w:spacing w:after="0"/>
+        <w:ind w:left="360"/>
+      </w:pPr>
+      <w:r>
         <w:rPr>
           <w:b/>
           <w:color w:val="1A8F5E"/>
         </w:rPr>
-        <w:t>*A. 50 %</w:t>
-      </w:r>
-    </w:p>
-    <w:p>
-      <w:pPr>
-        <w:spacing w:after="0"/>
-        <w:ind w:left="360"/>
-      </w:pPr>
-      <w:r>
-        <w:t>B. 25 %</w:t>
+        <w:t>*B. 50 %</w:t>
       </w:r>
     </w:p>
     <w:p>
@@ -531,11 +531,7 @@
         <w:ind w:left="360"/>
       </w:pPr>
       <w:r>
-        <w:rPr>
-          <w:b/>
-          <w:color w:val="1A8F5E"/>
-        </w:rPr>
-        <w:t>*A. 6</w:t>
+        <w:t>A. 9</w:t>
       </w:r>
     </w:p>
     <w:p>
@@ -553,7 +549,11 @@
         <w:ind w:left="360"/>
       </w:pPr>
       <w:r>
-        <w:t>C. 9</w:t>
+        <w:rPr>
+          <w:b/>
+          <w:color w:val="1A8F5E"/>
+        </w:rPr>
+        <w:t>*C. 6</w:t>
       </w:r>
     </w:p>
     <w:p>
@@ -591,38 +591,38 @@
         <w:ind w:left="360"/>
       </w:pPr>
       <w:r>
+        <w:t>A. Den stiger lidt</w:t>
+      </w:r>
+    </w:p>
+    <w:p>
+      <w:pPr>
+        <w:spacing w:after="0"/>
+        <w:ind w:left="360"/>
+      </w:pPr>
+      <w:r>
+        <w:t>B. Den falder</w:t>
+      </w:r>
+    </w:p>
+    <w:p>
+      <w:pPr>
+        <w:spacing w:after="0"/>
+        <w:ind w:left="360"/>
+      </w:pPr>
+      <w:r>
+        <w:t>C. Den bliver dobbelt så stor</w:t>
+      </w:r>
+    </w:p>
+    <w:p>
+      <w:pPr>
+        <w:spacing w:after="0"/>
+        <w:ind w:left="360"/>
+      </w:pPr>
+      <w:r>
         <w:rPr>
           <w:b/>
           <w:color w:val="1A8F5E"/>
         </w:rPr>
-        <w:t>*A. Ingenting</w:t>
-      </w:r>
-    </w:p>
-    <w:p>
-      <w:pPr>
-        <w:spacing w:after="0"/>
-        <w:ind w:left="360"/>
-      </w:pPr>
-      <w:r>
-        <w:t>B. Den bliver dobbelt så stor</w:t>
-      </w:r>
-    </w:p>
-    <w:p>
-      <w:pPr>
-        <w:spacing w:after="0"/>
-        <w:ind w:left="360"/>
-      </w:pPr>
-      <w:r>
-        <w:t>C. Den stiger lidt</w:t>
-      </w:r>
-    </w:p>
-    <w:p>
-      <w:pPr>
-        <w:spacing w:after="0"/>
-        <w:ind w:left="360"/>
-      </w:pPr>
-      <w:r>
-        <w:t>D. Den falder</w:t>
+        <w:t>*D. Ingenting</w:t>
       </w:r>
     </w:p>
     <w:p>
@@ -651,20 +651,20 @@
         <w:ind w:left="360"/>
       </w:pPr>
       <w:r>
+        <w:t>A. 40</w:t>
+      </w:r>
+    </w:p>
+    <w:p>
+      <w:pPr>
+        <w:spacing w:after="0"/>
+        <w:ind w:left="360"/>
+      </w:pPr>
+      <w:r>
         <w:rPr>
           <w:b/>
           <w:color w:val="1A8F5E"/>
         </w:rPr>
-        <w:t>*A. 8</w:t>
-      </w:r>
-    </w:p>
-    <w:p>
-      <w:pPr>
-        <w:spacing w:after="0"/>
-        <w:ind w:left="360"/>
-      </w:pPr>
-      <w:r>
-        <w:t>B. 6</w:t>
+        <w:t>*B. 8</w:t>
       </w:r>
     </w:p>
     <w:p>
@@ -682,7 +682,7 @@
         <w:ind w:left="360"/>
       </w:pPr>
       <w:r>
-        <w:t>D. 40</w:t>
+        <w:t>D. 6</w:t>
       </w:r>
     </w:p>
     <w:p>
@@ -711,11 +711,29 @@
         <w:ind w:left="360"/>
       </w:pPr>
       <w:r>
+        <w:t>A. 90°</w:t>
+      </w:r>
+    </w:p>
+    <w:p>
+      <w:pPr>
+        <w:spacing w:after="0"/>
+        <w:ind w:left="360"/>
+      </w:pPr>
+      <w:r>
+        <w:t>B. 15°</w:t>
+      </w:r>
+    </w:p>
+    <w:p>
+      <w:pPr>
+        <w:spacing w:after="0"/>
+        <w:ind w:left="360"/>
+      </w:pPr>
+      <w:r>
         <w:rPr>
           <w:b/>
           <w:color w:val="1A8F5E"/>
         </w:rPr>
-        <w:t>*A. 135°</w:t>
+        <w:t>*C. 135°</w:t>
       </w:r>
     </w:p>
     <w:p>
@@ -724,25 +742,7 @@
         <w:ind w:left="360"/>
       </w:pPr>
       <w:r>
-        <w:t>B. 150°</w:t>
-      </w:r>
-    </w:p>
-    <w:p>
-      <w:pPr>
-        <w:spacing w:after="0"/>
-        <w:ind w:left="360"/>
-      </w:pPr>
-      <w:r>
-        <w:t>C. 90°</w:t>
-      </w:r>
-    </w:p>
-    <w:p>
-      <w:pPr>
-        <w:spacing w:after="0"/>
-        <w:ind w:left="360"/>
-      </w:pPr>
-      <w:r>
-        <w:t>D. 15°</w:t>
+        <w:t>D. 150°</w:t>
       </w:r>
     </w:p>
     <w:p>
@@ -771,11 +771,7 @@
         <w:ind w:left="360"/>
       </w:pPr>
       <w:r>
-        <w:rPr>
-          <w:b/>
-          <w:color w:val="1A8F5E"/>
-        </w:rPr>
-        <w:t>*A. 72°</w:t>
+        <w:t>A. 80°</w:t>
       </w:r>
     </w:p>
     <w:p>
@@ -784,7 +780,7 @@
         <w:ind w:left="360"/>
       </w:pPr>
       <w:r>
-        <w:t>B. 80°</w:t>
+        <w:t>B. 45°</w:t>
       </w:r>
     </w:p>
     <w:p>
@@ -802,7 +798,11 @@
         <w:ind w:left="360"/>
       </w:pPr>
       <w:r>
-        <w:t>D. 45°</w:t>
+        <w:rPr>
+          <w:b/>
+          <w:color w:val="1A8F5E"/>
+        </w:rPr>
+        <w:t>*D. 72°</w:t>
       </w:r>
     </w:p>
     <w:p>
@@ -831,11 +831,7 @@
         <w:ind w:left="360"/>
       </w:pPr>
       <w:r>
-        <w:rPr>
-          <w:b/>
-          <w:color w:val="1A8F5E"/>
-        </w:rPr>
-        <w:t>*A. 25 %</w:t>
+        <w:t>A. 40 %</w:t>
       </w:r>
     </w:p>
     <w:p>
@@ -853,7 +849,11 @@
         <w:ind w:left="360"/>
       </w:pPr>
       <w:r>
-        <w:t>C. 40 %</w:t>
+        <w:rPr>
+          <w:b/>
+          <w:color w:val="1A8F5E"/>
+        </w:rPr>
+        <w:t>*C. 25 %</w:t>
       </w:r>
     </w:p>
     <w:p>
@@ -891,11 +891,29 @@
         <w:ind w:left="360"/>
       </w:pPr>
       <w:r>
+        <w:t>A. Svømning</w:t>
+      </w:r>
+    </w:p>
+    <w:p>
+      <w:pPr>
+        <w:spacing w:after="0"/>
+        <w:ind w:left="360"/>
+      </w:pPr>
+      <w:r>
+        <w:t>B. Andet</w:t>
+      </w:r>
+    </w:p>
+    <w:p>
+      <w:pPr>
+        <w:spacing w:after="0"/>
+        <w:ind w:left="360"/>
+      </w:pPr>
+      <w:r>
         <w:rPr>
           <w:b/>
           <w:color w:val="1A8F5E"/>
         </w:rPr>
-        <w:t>*A. Håndbold</w:t>
+        <w:t>*C. Håndbold</w:t>
       </w:r>
     </w:p>
     <w:p>
@@ -904,25 +922,7 @@
         <w:ind w:left="360"/>
       </w:pPr>
       <w:r>
-        <w:t>B. Fodbold</w:t>
-      </w:r>
-    </w:p>
-    <w:p>
-      <w:pPr>
-        <w:spacing w:after="0"/>
-        <w:ind w:left="360"/>
-      </w:pPr>
-      <w:r>
-        <w:t>C. Svømning</w:t>
-      </w:r>
-    </w:p>
-    <w:p>
-      <w:pPr>
-        <w:spacing w:after="0"/>
-        <w:ind w:left="360"/>
-      </w:pPr>
-      <w:r>
-        <w:t>D. Andet</w:t>
+        <w:t>D. Fodbold</w:t>
       </w:r>
     </w:p>
     <w:p>
@@ -951,11 +951,29 @@
         <w:ind w:left="360"/>
       </w:pPr>
       <w:r>
+        <w:t>A. 360 %</w:t>
+      </w:r>
+    </w:p>
+    <w:p>
+      <w:pPr>
+        <w:spacing w:after="0"/>
+        <w:ind w:left="360"/>
+      </w:pPr>
+      <w:r>
+        <w:t>B. Gennemsnittet</w:t>
+      </w:r>
+    </w:p>
+    <w:p>
+      <w:pPr>
+        <w:spacing w:after="0"/>
+        <w:ind w:left="360"/>
+      </w:pPr>
+      <w:r>
         <w:rPr>
           <w:b/>
           <w:color w:val="1A8F5E"/>
         </w:rPr>
-        <w:t>*A. 100 %</w:t>
+        <w:t>*C. 100 %</w:t>
       </w:r>
     </w:p>
     <w:p>
@@ -964,25 +982,7 @@
         <w:ind w:left="360"/>
       </w:pPr>
       <w:r>
-        <w:t>B. 360 %</w:t>
-      </w:r>
-    </w:p>
-    <w:p>
-      <w:pPr>
-        <w:spacing w:after="0"/>
-        <w:ind w:left="360"/>
-      </w:pPr>
-      <w:r>
-        <w:t>C. Antallet af observationer</w:t>
-      </w:r>
-    </w:p>
-    <w:p>
-      <w:pPr>
-        <w:spacing w:after="0"/>
-        <w:ind w:left="360"/>
-      </w:pPr>
-      <w:r>
-        <w:t>D. Gennemsnittet</w:t>
+        <w:t>D. Antallet af observationer</w:t>
       </w:r>
     </w:p>
     <w:p>
@@ -1071,11 +1071,7 @@
         <w:ind w:left="360"/>
       </w:pPr>
       <w:r>
-        <w:rPr>
-          <w:b/>
-          <w:color w:val="1A8F5E"/>
-        </w:rPr>
-        <w:t>*A. Omkring 172 cm</w:t>
+        <w:t>A. Omkring 155 cm</w:t>
       </w:r>
     </w:p>
     <w:p>
@@ -1093,7 +1089,11 @@
         <w:ind w:left="360"/>
       </w:pPr>
       <w:r>
-        <w:t>C. Omkring 180 cm</w:t>
+        <w:rPr>
+          <w:b/>
+          <w:color w:val="1A8F5E"/>
+        </w:rPr>
+        <w:t>*C. Omkring 172 cm</w:t>
       </w:r>
     </w:p>
     <w:p>
@@ -1102,7 +1102,7 @@
         <w:ind w:left="360"/>
       </w:pPr>
       <w:r>
-        <w:t>D. Omkring 155 cm</w:t>
+        <w:t>D. Omkring 180 cm</w:t>
       </w:r>
     </w:p>
     <w:p>
@@ -1131,11 +1131,20 @@
         <w:ind w:left="360"/>
       </w:pPr>
       <w:r>
+        <w:t>A. 25 %</w:t>
+      </w:r>
+    </w:p>
+    <w:p>
+      <w:pPr>
+        <w:spacing w:after="0"/>
+        <w:ind w:left="360"/>
+      </w:pPr>
+      <w:r>
         <w:rPr>
           <w:b/>
           <w:color w:val="1A8F5E"/>
         </w:rPr>
-        <w:t>*A. 80 %</w:t>
+        <w:t>*B. 80 %</w:t>
       </w:r>
     </w:p>
     <w:p>
@@ -1144,7 +1153,7 @@
         <w:ind w:left="360"/>
       </w:pPr>
       <w:r>
-        <w:t>B. 25 %</w:t>
+        <w:t>C. 35 %</w:t>
       </w:r>
     </w:p>
     <w:p>
@@ -1153,16 +1162,7 @@
         <w:ind w:left="360"/>
       </w:pPr>
       <w:r>
-        <w:t>C. 100 %</w:t>
-      </w:r>
-    </w:p>
-    <w:p>
-      <w:pPr>
-        <w:spacing w:after="0"/>
-        <w:ind w:left="360"/>
-      </w:pPr>
-      <w:r>
-        <w:t>D. 35 %</w:t>
+        <w:t>D. 100 %</w:t>
       </w:r>
     </w:p>
     <w:p>
@@ -1191,11 +1191,7 @@
         <w:ind w:left="360"/>
       </w:pPr>
       <w:r>
-        <w:rPr>
-          <w:b/>
-          <w:color w:val="1A8F5E"/>
-        </w:rPr>
-        <w:t>*A. 4-6 timer</w:t>
+        <w:t>A. 2-4 timer</w:t>
       </w:r>
     </w:p>
     <w:p>
@@ -1213,7 +1209,11 @@
         <w:ind w:left="360"/>
       </w:pPr>
       <w:r>
-        <w:t>C. 2-4 timer</w:t>
+        <w:rPr>
+          <w:b/>
+          <w:color w:val="1A8F5E"/>
+        </w:rPr>
+        <w:t>*C. 4-6 timer</w:t>
       </w:r>
     </w:p>
     <w:p>
@@ -1251,20 +1251,20 @@
         <w:ind w:left="360"/>
       </w:pPr>
       <w:r>
+        <w:t>A. 4 gange</w:t>
+      </w:r>
+    </w:p>
+    <w:p>
+      <w:pPr>
+        <w:spacing w:after="0"/>
+        <w:ind w:left="360"/>
+      </w:pPr>
+      <w:r>
         <w:rPr>
           <w:b/>
           <w:color w:val="1A8F5E"/>
         </w:rPr>
-        <w:t>*A. 2 gange</w:t>
-      </w:r>
-    </w:p>
-    <w:p>
-      <w:pPr>
-        <w:spacing w:after="0"/>
-        <w:ind w:left="360"/>
-      </w:pPr>
-      <w:r>
-        <w:t>B. 1 gang</w:t>
+        <w:t>*B. 2 gange</w:t>
       </w:r>
     </w:p>
     <w:p>
@@ -1282,7 +1282,7 @@
         <w:ind w:left="360"/>
       </w:pPr>
       <w:r>
-        <w:t>D. 4 gange</w:t>
+        <w:t>D. 1 gang</w:t>
       </w:r>
     </w:p>
     <w:p>
@@ -1311,11 +1311,7 @@
         <w:ind w:left="360"/>
       </w:pPr>
       <w:r>
-        <w:rPr>
-          <w:b/>
-          <w:color w:val="1A8F5E"/>
-        </w:rPr>
-        <w:t>*A. 6 ud af 36</w:t>
+        <w:t>A. 7 ud af 36</w:t>
       </w:r>
     </w:p>
     <w:p>
@@ -1333,7 +1329,11 @@
         <w:ind w:left="360"/>
       </w:pPr>
       <w:r>
-        <w:t>C. 7 ud af 36</w:t>
+        <w:rPr>
+          <w:b/>
+          <w:color w:val="1A8F5E"/>
+        </w:rPr>
+        <w:t>*C. 6 ud af 36</w:t>
       </w:r>
     </w:p>
     <w:p>
@@ -1453,7 +1453,7 @@
         <w:ind w:left="360"/>
       </w:pPr>
       <w:r>
-        <w:t>C. 12 ud af 36</w:t>
+        <w:t>C. 2 ud af 36</w:t>
       </w:r>
     </w:p>
     <w:p>
@@ -1462,7 +1462,7 @@
         <w:ind w:left="360"/>
       </w:pPr>
       <w:r>
-        <w:t>D. 2 ud af 36</w:t>
+        <w:t>D. 12 ud af 36</w:t>
       </w:r>
     </w:p>
     <w:p>
@@ -1491,20 +1491,20 @@
         <w:ind w:left="360"/>
       </w:pPr>
       <w:r>
+        <w:t>A. 21 procentpoint</w:t>
+      </w:r>
+    </w:p>
+    <w:p>
+      <w:pPr>
+        <w:spacing w:after="0"/>
+        <w:ind w:left="360"/>
+      </w:pPr>
+      <w:r>
         <w:rPr>
           <w:b/>
           <w:color w:val="1A8F5E"/>
         </w:rPr>
-        <w:t>*A. 6 procentpoint</w:t>
-      </w:r>
-    </w:p>
-    <w:p>
-      <w:pPr>
-        <w:spacing w:after="0"/>
-        <w:ind w:left="360"/>
-      </w:pPr>
-      <w:r>
-        <w:t>B. 40 procentpoint</w:t>
+        <w:t>*B. 6 procentpoint</w:t>
       </w:r>
     </w:p>
     <w:p>
@@ -1522,7 +1522,7 @@
         <w:ind w:left="360"/>
       </w:pPr>
       <w:r>
-        <w:t>D. 21 procentpoint</w:t>
+        <w:t>D. 40 procentpoint</w:t>
       </w:r>
     </w:p>
     <w:p>
@@ -1564,7 +1564,7 @@
         <w:ind w:left="360"/>
       </w:pPr>
       <w:r>
-        <w:t>B. 6 %</w:t>
+        <w:t>B. 36 %</w:t>
       </w:r>
     </w:p>
     <w:p>
@@ -1582,7 +1582,7 @@
         <w:ind w:left="360"/>
       </w:pPr>
       <w:r>
-        <w:t>D. 36 %</w:t>
+        <w:t>D. 6 %</w:t>
       </w:r>
     </w:p>
     <w:p>
@@ -1611,11 +1611,20 @@
         <w:ind w:left="360"/>
       </w:pPr>
       <w:r>
+        <w:t>A. 38 %</w:t>
+      </w:r>
+    </w:p>
+    <w:p>
+      <w:pPr>
+        <w:spacing w:after="0"/>
+        <w:ind w:left="360"/>
+      </w:pPr>
+      <w:r>
         <w:rPr>
           <w:b/>
           <w:color w:val="1A8F5E"/>
         </w:rPr>
-        <w:t>*A. 9,5 %</w:t>
+        <w:t>*B. 9,5 %</w:t>
       </w:r>
     </w:p>
     <w:p>
@@ -1624,7 +1633,7 @@
         <w:ind w:left="360"/>
       </w:pPr>
       <w:r>
-        <w:t>B. 38 %</w:t>
+        <w:t>C. 90,5 %</w:t>
       </w:r>
     </w:p>
     <w:p>
@@ -1633,16 +1642,7 @@
         <w:ind w:left="360"/>
       </w:pPr>
       <w:r>
-        <w:t>C. 10,5 %</w:t>
-      </w:r>
-    </w:p>
-    <w:p>
-      <w:pPr>
-        <w:spacing w:after="0"/>
-        <w:ind w:left="360"/>
-      </w:pPr>
-      <w:r>
-        <w:t>D. 90,5 %</w:t>
+        <w:t>D. 10,5 %</w:t>
       </w:r>
     </w:p>
     <w:p>
@@ -1684,7 +1684,7 @@
         <w:ind w:left="360"/>
       </w:pPr>
       <w:r>
-        <w:t>B. Forskellene ser mindre ud, end de er</w:t>
+        <w:t>B. Ingenting — tallene er jo de samme</w:t>
       </w:r>
     </w:p>
     <w:p>
@@ -1693,7 +1693,7 @@
         <w:ind w:left="360"/>
       </w:pPr>
       <w:r>
-        <w:t>C. Ingenting — tallene er jo de samme</w:t>
+        <w:t>C. Diagrammet bliver ulovligt</w:t>
       </w:r>
     </w:p>
     <w:p>
@@ -1702,7 +1702,7 @@
         <w:ind w:left="360"/>
       </w:pPr>
       <w:r>
-        <w:t>D. Diagrammet bliver ulovligt</w:t>
+        <w:t>D. Forskellene ser mindre ud, end de er</w:t>
       </w:r>
     </w:p>
     <w:p>
@@ -1731,11 +1731,7 @@
         <w:ind w:left="360"/>
       </w:pPr>
       <w:r>
-        <w:rPr>
-          <w:b/>
-          <w:color w:val="1A8F5E"/>
-        </w:rPr>
-        <w:t>*A. 4 gange</w:t>
+        <w:t>A. 8 gange</w:t>
       </w:r>
     </w:p>
     <w:p>
@@ -1753,7 +1749,7 @@
         <w:ind w:left="360"/>
       </w:pPr>
       <w:r>
-        <w:t>C. 8 gange</w:t>
+        <w:t>C. 16 gange</w:t>
       </w:r>
     </w:p>
     <w:p>
@@ -1762,7 +1758,11 @@
         <w:ind w:left="360"/>
       </w:pPr>
       <w:r>
-        <w:t>D. 16 gange</w:t>
+        <w:rPr>
+          <w:b/>
+          <w:color w:val="1A8F5E"/>
+        </w:rPr>
+        <w:t>*D. 4 gange</w:t>
       </w:r>
     </w:p>
     <w:p>
@@ -1791,11 +1791,7 @@
         <w:ind w:left="360"/>
       </w:pPr>
       <w:r>
-        <w:rPr>
-          <w:b/>
-          <w:color w:val="1A8F5E"/>
-        </w:rPr>
-        <w:t>*A. Medianen, 24.000 kr</w:t>
+        <w:t>A. Gennemsnittet, 98.800 kr</w:t>
       </w:r>
     </w:p>
     <w:p>
@@ -1804,7 +1800,7 @@
         <w:ind w:left="360"/>
       </w:pPr>
       <w:r>
-        <w:t>B. Gennemsnittet, 98.800 kr</w:t>
+        <w:t>B. Summen af de fem</w:t>
       </w:r>
     </w:p>
     <w:p>
@@ -1822,7 +1818,11 @@
         <w:ind w:left="360"/>
       </w:pPr>
       <w:r>
-        <w:t>D. Summen af de fem</w:t>
+        <w:rPr>
+          <w:b/>
+          <w:color w:val="1A8F5E"/>
+        </w:rPr>
+        <w:t>*D. Medianen, 24.000 kr</w:t>
       </w:r>
     </w:p>
     <w:p>

</xml_diff>